<commit_message>
feat(btnn): hoàn trả - khối lặp cán bộ Mẫu 37/38, Sở/Bộ Tư pháp theo Cấp đơn vị, ô trống "-"
- M1: Mẫu 37/BTNN, 38/BTNN (2 bản template) thêm ##BatDauKhoiCanBo##/##KetThucKhoiCanBo## và ##SttCanBo##; dòng "Điều 1." in 01 lần trước khối lặp; cập nhật bảng mapping (2 bản giống nhau).
- M2: SRS Xem xét hoàn trả - Sở Tư pháp / Bộ Tư pháp xác định theo Cấp đơn vị của Cơ quan trực tiếp quản lý người thi hành công vụ gây thiệt hại (Trung ương: Bộ Tư pháp; Địa phương: Sở Tư pháp).
- L4: Thống nhất ô trống "-" tại lưới cán bộ Bước 2/3/4, chi tiết cán bộ, khối QĐ đình chỉ / miễn-giảm bổ sung, popup trình ký chung; cập nhật SRS; bump ?v= các JS.

Co-Authored-By: Claude Opus 5.5 <noreply@anthropic.com>
</commit_message>
<xml_diff>
--- a/Bieu_mau/Boi_thuong_nha_nuoc/Mau_37_BTNN_Template.docx
+++ b/Bieu_mau/Boi_thuong_nha_nuoc/Mau_37_BTNN_Template.docx
@@ -260,7 +260,35 @@
           <w:sz w:val="28"/>
           <w:szCs w:val="28"/>
         </w:rPr>
-        <w:t xml:space="preserve">Điều 1. Giảm mức hoàn trả cho Ông/Bà ##TenNguoiThiHanhCongVu## do ##LyDoGiamMucHoanTra## cụ thể như sau:</w:t>
+        <w:t xml:space="preserve">Điều 1.</w:t>
+      </w:r>
+    </w:p>
+    <w:p>
+      <w:pPr>
+        <w:spacing w:after="120" w:line="276" w:lineRule="auto"/>
+        <w:ind w:firstLine="567"/>
+        <w:jc w:val="both"/>
+      </w:pPr>
+      <w:r>
+        <w:rPr>
+          <w:sz w:val="28"/>
+          <w:szCs w:val="28"/>
+        </w:rPr>
+        <w:t xml:space="preserve">##BatDauKhoiCanBo##</w:t>
+      </w:r>
+    </w:p>
+    <w:p>
+      <w:pPr>
+        <w:spacing w:after="120" w:line="276" w:lineRule="auto"/>
+        <w:ind w:firstLine="567"/>
+        <w:jc w:val="both"/>
+      </w:pPr>
+      <w:r>
+        <w:rPr>
+          <w:sz w:val="28"/>
+          <w:szCs w:val="28"/>
+        </w:rPr>
+        <w:t xml:space="preserve">##SttCanBo##. Giảm mức hoàn trả cho Ông/Bà ##TenNguoiThiHanhCongVu## do ##LyDoGiamMucHoanTra## cụ thể như sau:</w:t>
       </w:r>
     </w:p>
     <w:p>
@@ -359,6 +387,20 @@
           <w:szCs w:val="28"/>
         </w:rPr>
         <w:t xml:space="preserve">- Phương thức hoàn trả: ##PhuongThucHoanTra##</w:t>
+      </w:r>
+    </w:p>
+    <w:p>
+      <w:pPr>
+        <w:spacing w:after="120" w:line="276" w:lineRule="auto"/>
+        <w:ind w:firstLine="567"/>
+        <w:jc w:val="both"/>
+      </w:pPr>
+      <w:r>
+        <w:rPr>
+          <w:sz w:val="28"/>
+          <w:szCs w:val="28"/>
+        </w:rPr>
+        <w:t xml:space="preserve">##KetThucKhoiCanBo##</w:t>
       </w:r>
     </w:p>
     <w:p>

</xml_diff>